<commit_message>
docs: align schedule and project plan with DRE numbering
</commit_message>
<xml_diff>
--- a/documents/AL - Plano de Projeto_00.docx
+++ b/documents/AL - Plano de Projeto_00.docx
@@ -428,10 +428,6 @@
         </w:tc>
       </w:tr>
       <w:tr>
-        <w:trPr>
-          <w:gridAfter w:val="1"/>
-          <w:wAfter w:w="2000" w:type="dxa"/>
-        </w:trPr>
         <w:tc>
           <w:tcPr>
             <w:tcW w:w="1500" w:type="dxa"/>
@@ -448,7 +444,15 @@
               <w:right w:w="80" w:type="dxa"/>
             </w:tcMar>
           </w:tcPr>
-          <w:p/>
+          <w:p>
+            <w:r>
+              <w:rPr>
+                <w:sz w:val="18"/>
+                <w:szCs w:val="18"/>
+              </w:rPr>
+              <w:t>28/10/2026</w:t>
+            </w:r>
+          </w:p>
         </w:tc>
         <w:tc>
           <w:tcPr>
@@ -466,7 +470,15 @@
               <w:right w:w="80" w:type="dxa"/>
             </w:tcMar>
           </w:tcPr>
-          <w:p/>
+          <w:p>
+            <w:r>
+              <w:rPr>
+                <w:sz w:val="18"/>
+                <w:szCs w:val="18"/>
+              </w:rPr>
+              <w:t>1.1</w:t>
+            </w:r>
+          </w:p>
         </w:tc>
         <w:tc>
           <w:tcPr>
@@ -484,7 +496,37 @@
               <w:right w:w="80" w:type="dxa"/>
             </w:tcMar>
           </w:tcPr>
-          <w:p/>
+          <w:p>
+            <w:r>
+              <w:rPr>
+                <w:sz w:val="18"/>
+                <w:szCs w:val="18"/>
+              </w:rPr>
+              <w:t>Release 01 (controle de mudanças): numeração dos RFCs alinhada ao DRE v1.0 (Organizador como perfil do RFC01; inclusão do RFC09), horas por release e produtividade (4 h/PCU) atualizadas.</w:t>
+            </w:r>
+          </w:p>
+        </w:tc>
+        <w:tc>
+          <w:tcPr>
+            <w:tcW w:w="2000" w:type="dxa"/>
+            <w:tcBorders>
+              <w:top w:val="single" w:sz="4" w:space="0" w:color="808080"/>
+              <w:left w:val="single" w:sz="4" w:space="0" w:color="808080"/>
+              <w:bottom w:val="single" w:sz="4" w:space="0" w:color="808080"/>
+              <w:right w:val="single" w:sz="4" w:space="0" w:color="808080"/>
+            </w:tcBorders>
+            <w:tcMar>
+              <w:top w:w="50" w:type="dxa"/>
+              <w:left w:w="80" w:type="dxa"/>
+              <w:bottom w:w="50" w:type="dxa"/>
+              <w:right w:w="80" w:type="dxa"/>
+            </w:tcMar>
+          </w:tcPr>
+          <w:p>
+            <w:r>
+              <w:t>Alex</w:t>
+            </w:r>
+          </w:p>
         </w:tc>
       </w:tr>
       <w:tr>
@@ -1863,7 +1905,7 @@
                 <w:sz w:val="18"/>
                 <w:szCs w:val="18"/>
               </w:rPr>
-              <w:t>RFC01 Usuário, RFC02 Organizador/Liga, RFC03 Campeonato, RFC04 Equipe, RFC05 Partida, RFC06 Resultado, RFC07 Inscrição, RFC08 Aviso, RFR01 Relatório de tabela e classificação</w:t>
+              <w:t>RFC01 Usuário, RFC02 Campeonato, RFC03 Tabela de Jogos, RFC04 Resultados e Classificação, RFC07 Equipe, RFC08 Inscrição, RFC09 Seguir Campeonatos e Equipes, RFC10 Avisos, RFC13 Relatório de Inscrições</w:t>
             </w:r>
           </w:p>
         </w:tc>
@@ -8104,7 +8146,7 @@
         <w:spacing w:after="100"/>
       </w:pPr>
       <w:r>
-        <w:t>Tamanho: 100 PCU (atores 10 + casos de uso 90, sendo 1 simples, 7 médios e 1 complexo). Produtividade: 8 h/PCU. Detalhes na planilha de estimativa.</w:t>
+        <w:t>Tamanho: 100 PCU (atores 10 + casos de uso 90, sendo 1 simples, 7 médios e 1 complexo). Produtividade: 4 h/PCU. Detalhes na planilha de estimativa.</w:t>
       </w:r>
     </w:p>
     <w:p>
@@ -8454,7 +8496,7 @@
               <w:jc w:val="center"/>
             </w:pPr>
             <w:r>
-              <w:t>71,7</w:t>
+              <w:t>82,7</w:t>
             </w:r>
           </w:p>
         </w:tc>
@@ -8480,7 +8522,7 @@
                 <w:sz w:val="18"/>
                 <w:szCs w:val="18"/>
               </w:rPr>
-              <w:t>Ambiente (repositório, bug tracker, Selenium), arquitetura, CRUDs 1 e 2</w:t>
+              <w:t>Ambiente (repositório, bug tracker, Selenium), arquitetura, CRUDs RFC01 (Usuário) e RFC02 (Campeonato)</w:t>
             </w:r>
           </w:p>
         </w:tc>
@@ -8559,7 +8601,7 @@
               <w:jc w:val="center"/>
             </w:pPr>
             <w:r>
-              <w:t>80,1</w:t>
+              <w:t>69,1</w:t>
             </w:r>
           </w:p>
         </w:tc>
@@ -8585,7 +8627,7 @@
                 <w:sz w:val="18"/>
                 <w:szCs w:val="18"/>
               </w:rPr>
-              <w:t>CRUDs 3 (Campeonato) e 4 (Equipe)</w:t>
+              <w:t>CRUDs RFC07 (Equipe) e RFC03 (Tabela de Jogos)</w:t>
             </w:r>
           </w:p>
         </w:tc>
@@ -8690,7 +8732,7 @@
                 <w:sz w:val="18"/>
                 <w:szCs w:val="18"/>
               </w:rPr>
-              <w:t>CRUDs 5 (Partida) e 6 (Resultado) e relatório de classificação</w:t>
+              <w:t>CRUDs RFC08 (Inscrição) e RFC04 (Resultados e Classificação) e relatório RFC13 (Inscrições)</w:t>
             </w:r>
           </w:p>
         </w:tc>
@@ -8795,7 +8837,7 @@
                 <w:sz w:val="18"/>
                 <w:szCs w:val="18"/>
               </w:rPr>
-              <w:t>CRUDs 7 (Inscrição) e 8 (Aviso), testes finais e fechamento</w:t>
+              <w:t>CRUDs RFC09 (Seguir) e RFC10 (Avisos), testes finais e fechamento</w:t>
             </w:r>
           </w:p>
         </w:tc>

</xml_diff>